<commit_message>
Updated Drive Log NoSQL DB Schema
</commit_message>
<xml_diff>
--- a/ProjectDocs/Drive Log Cosmos NoSQL Database Schema.docx
+++ b/ProjectDocs/Drive Log Cosmos NoSQL Database Schema.docx
@@ -413,15 +413,24 @@
       </w:r>
       <w:proofErr w:type="spellEnd"/>
       <w:r>
-        <w:t xml:space="preserve"> like distance traveled, average speed</w:t>
+        <w:t>, such as</w:t>
+      </w:r>
+      <w:r>
+        <w:t xml:space="preserve"> distance </w:t>
       </w:r>
       <w:proofErr w:type="gramStart"/>
       <w:r>
-        <w:t>, how</w:t>
+        <w:t>traveled</w:t>
       </w:r>
       <w:proofErr w:type="gramEnd"/>
       <w:r>
-        <w:t xml:space="preserve"> many points were taken on the route.</w:t>
+        <w:t xml:space="preserve">, average speed, </w:t>
+      </w:r>
+      <w:r>
+        <w:t xml:space="preserve">and </w:t>
+      </w:r>
+      <w:r>
+        <w:t>how many points were taken on the route.</w:t>
       </w:r>
     </w:p>
     <w:p>
@@ -617,6 +626,348 @@
       <w:proofErr w:type="spellEnd"/>
       <w:r>
         <w:t xml:space="preserve"> – Date/Time route was completed.</w:t>
+      </w:r>
+    </w:p>
+    <w:p>
+      <w:pPr>
+        <w:rPr>
+          <w:b/>
+          <w:bCs/>
+        </w:rPr>
+      </w:pPr>
+      <w:r>
+        <w:rPr>
+          <w:b/>
+          <w:bCs/>
+        </w:rPr>
+        <w:t>Users</w:t>
+      </w:r>
+    </w:p>
+    <w:p>
+      <w:r>
+        <w:tab/>
+      </w:r>
+      <w:proofErr w:type="gramStart"/>
+      <w:r>
+        <w:t>Users</w:t>
+      </w:r>
+      <w:proofErr w:type="gramEnd"/>
+      <w:r>
+        <w:t xml:space="preserve"> </w:t>
+      </w:r>
+      <w:proofErr w:type="gramStart"/>
+      <w:r>
+        <w:t>container has</w:t>
+      </w:r>
+      <w:proofErr w:type="gramEnd"/>
+      <w:r>
+        <w:t xml:space="preserve"> information about each user in the system. Users can have roles assigned to them, designating them as an Admin, Manager, or Driver.</w:t>
+      </w:r>
+    </w:p>
+    <w:p>
+      <w:r>
+        <w:tab/>
+        <w:t xml:space="preserve">Attributes for the </w:t>
+      </w:r>
+      <w:proofErr w:type="gramStart"/>
+      <w:r>
+        <w:t>users</w:t>
+      </w:r>
+      <w:proofErr w:type="gramEnd"/>
+      <w:r>
+        <w:t xml:space="preserve"> information:</w:t>
+      </w:r>
+    </w:p>
+    <w:p>
+      <w:r>
+        <w:tab/>
+      </w:r>
+      <w:r>
+        <w:tab/>
+        <w:t>Id – Object ID of the user from Azure Entra ID.</w:t>
+      </w:r>
+    </w:p>
+    <w:p>
+      <w:r>
+        <w:tab/>
+      </w:r>
+      <w:r>
+        <w:tab/>
+      </w:r>
+      <w:proofErr w:type="spellStart"/>
+      <w:r>
+        <w:t>userId</w:t>
+      </w:r>
+      <w:proofErr w:type="spellEnd"/>
+      <w:r>
+        <w:t xml:space="preserve"> – Same as id.</w:t>
+      </w:r>
+    </w:p>
+    <w:p>
+      <w:r>
+        <w:tab/>
+      </w:r>
+      <w:r>
+        <w:tab/>
+        <w:t>Username – The UPN/Email of the user.</w:t>
+      </w:r>
+    </w:p>
+    <w:p>
+      <w:r>
+        <w:tab/>
+      </w:r>
+      <w:r>
+        <w:tab/>
+        <w:t>Role – The role of the user. Driver, Manager, or Admin.</w:t>
+      </w:r>
+    </w:p>
+    <w:p>
+      <w:r>
+        <w:tab/>
+      </w:r>
+      <w:r>
+        <w:tab/>
+      </w:r>
+      <w:proofErr w:type="spellStart"/>
+      <w:r>
+        <w:t>managerId</w:t>
+      </w:r>
+      <w:proofErr w:type="spellEnd"/>
+      <w:r>
+        <w:t xml:space="preserve"> – The </w:t>
+      </w:r>
+      <w:proofErr w:type="spellStart"/>
+      <w:r>
+        <w:t>userId</w:t>
+      </w:r>
+      <w:proofErr w:type="spellEnd"/>
+      <w:r>
+        <w:t xml:space="preserve"> of the manager for this user. </w:t>
+      </w:r>
+      <w:proofErr w:type="gramStart"/>
+      <w:r>
+        <w:t>Manager is</w:t>
+      </w:r>
+      <w:proofErr w:type="gramEnd"/>
+      <w:r>
+        <w:t xml:space="preserve"> allowed to see </w:t>
+      </w:r>
+      <w:r>
+        <w:t xml:space="preserve">the </w:t>
+      </w:r>
+      <w:r>
+        <w:t>route data for all drivers associated with them.</w:t>
+      </w:r>
+    </w:p>
+    <w:p>
+      <w:r>
+        <w:lastRenderedPageBreak/>
+        <w:tab/>
+      </w:r>
+      <w:r>
+        <w:tab/>
+      </w:r>
+      <w:proofErr w:type="spellStart"/>
+      <w:r>
+        <w:t>createdAt</w:t>
+      </w:r>
+      <w:proofErr w:type="spellEnd"/>
+      <w:r>
+        <w:t xml:space="preserve"> – Date the user account was created.</w:t>
+      </w:r>
+    </w:p>
+    <w:p>
+      <w:pPr>
+        <w:rPr>
+          <w:b/>
+          <w:bCs/>
+        </w:rPr>
+      </w:pPr>
+      <w:r>
+        <w:rPr>
+          <w:b/>
+          <w:bCs/>
+        </w:rPr>
+        <w:t>Assignments</w:t>
+      </w:r>
+    </w:p>
+    <w:p>
+      <w:r>
+        <w:tab/>
+        <w:t xml:space="preserve">The container has information for jobs/assignments for each user. An assignment is associated with a driver. </w:t>
+      </w:r>
+    </w:p>
+    <w:p>
+      <w:r>
+        <w:tab/>
+        <w:t>Attributes for the assignments:</w:t>
+      </w:r>
+    </w:p>
+    <w:p>
+      <w:r>
+        <w:tab/>
+      </w:r>
+      <w:r>
+        <w:tab/>
+        <w:t>Id – Unique Id generated for each assignment</w:t>
+      </w:r>
+    </w:p>
+    <w:p>
+      <w:r>
+        <w:tab/>
+      </w:r>
+      <w:r>
+        <w:tab/>
+      </w:r>
+      <w:proofErr w:type="spellStart"/>
+      <w:r>
+        <w:t>driverId</w:t>
+      </w:r>
+      <w:proofErr w:type="spellEnd"/>
+      <w:r>
+        <w:t xml:space="preserve"> – </w:t>
+      </w:r>
+      <w:proofErr w:type="spellStart"/>
+      <w:r>
+        <w:t>UserId</w:t>
+      </w:r>
+      <w:proofErr w:type="spellEnd"/>
+      <w:r>
+        <w:t xml:space="preserve"> of the driver associated with the assignment</w:t>
+      </w:r>
+    </w:p>
+    <w:p>
+      <w:r>
+        <w:tab/>
+      </w:r>
+      <w:r>
+        <w:tab/>
+      </w:r>
+      <w:proofErr w:type="spellStart"/>
+      <w:r>
+        <w:t>driverEmail</w:t>
+      </w:r>
+      <w:proofErr w:type="spellEnd"/>
+      <w:r>
+        <w:t xml:space="preserve"> – Email address of the driver.</w:t>
+      </w:r>
+    </w:p>
+    <w:p>
+      <w:r>
+        <w:tab/>
+      </w:r>
+      <w:r>
+        <w:tab/>
+      </w:r>
+      <w:proofErr w:type="spellStart"/>
+      <w:r>
+        <w:t>createdById</w:t>
+      </w:r>
+      <w:proofErr w:type="spellEnd"/>
+      <w:r>
+        <w:t xml:space="preserve"> – The </w:t>
+      </w:r>
+      <w:proofErr w:type="spellStart"/>
+      <w:r>
+        <w:t>userId</w:t>
+      </w:r>
+      <w:proofErr w:type="spellEnd"/>
+      <w:r>
+        <w:t xml:space="preserve"> of the account that created the assignment.</w:t>
+      </w:r>
+    </w:p>
+    <w:p>
+      <w:r>
+        <w:tab/>
+      </w:r>
+      <w:r>
+        <w:tab/>
+      </w:r>
+      <w:proofErr w:type="spellStart"/>
+      <w:r>
+        <w:t>createdByRole</w:t>
+      </w:r>
+      <w:proofErr w:type="spellEnd"/>
+      <w:r>
+        <w:t xml:space="preserve"> – The role of the user who created the assignment.</w:t>
+      </w:r>
+    </w:p>
+    <w:p>
+      <w:r>
+        <w:tab/>
+      </w:r>
+      <w:r>
+        <w:tab/>
+      </w:r>
+      <w:r>
+        <w:t>Title – Title for the assignment. Example Deliver flowers to Gloria’s Floral shop.</w:t>
+      </w:r>
+    </w:p>
+    <w:p>
+      <w:r>
+        <w:tab/>
+      </w:r>
+      <w:r>
+        <w:tab/>
+        <w:t>Notes – Notes or driver alerts for the assignment.</w:t>
+      </w:r>
+    </w:p>
+    <w:p>
+      <w:r>
+        <w:tab/>
+      </w:r>
+      <w:r>
+        <w:tab/>
+        <w:t>Priority – Notes if the assignment is normal or an urgent job requiring expedition.</w:t>
+      </w:r>
+    </w:p>
+    <w:p>
+      <w:r>
+        <w:tab/>
+      </w:r>
+      <w:r>
+        <w:tab/>
+        <w:t xml:space="preserve">Status – Is the job open, </w:t>
+      </w:r>
+      <w:proofErr w:type="gramStart"/>
+      <w:r>
+        <w:t>assigned ,</w:t>
+      </w:r>
+      <w:proofErr w:type="gramEnd"/>
+      <w:r>
+        <w:t xml:space="preserve"> in progress, done, etc.</w:t>
+      </w:r>
+    </w:p>
+    <w:p>
+      <w:r>
+        <w:tab/>
+      </w:r>
+      <w:r>
+        <w:tab/>
+      </w:r>
+      <w:proofErr w:type="spellStart"/>
+      <w:r>
+        <w:t>createdAt</w:t>
+      </w:r>
+      <w:proofErr w:type="spellEnd"/>
+      <w:r>
+        <w:t xml:space="preserve"> – Time assignment was created</w:t>
+      </w:r>
+    </w:p>
+    <w:p>
+      <w:r>
+        <w:tab/>
+      </w:r>
+      <w:r>
+        <w:tab/>
+      </w:r>
+      <w:proofErr w:type="spellStart"/>
+      <w:r>
+        <w:t>updatedAt</w:t>
+      </w:r>
+      <w:proofErr w:type="spellEnd"/>
+      <w:r>
+        <w:t xml:space="preserve"> – Time of last update.</w:t>
       </w:r>
     </w:p>
     <w:p/>
@@ -696,7 +1047,37 @@
       </w:r>
       <w:proofErr w:type="spellEnd"/>
       <w:r>
-        <w:t>": "test-user",</w:t>
+        <w:t>": "</w:t>
+      </w:r>
+      <w:r>
+        <w:t>3517b7f7-0e95-4d79-b7d0-4c2f01244c2a</w:t>
+      </w:r>
+    </w:p>
+    <w:p>
+      <w:r>
+        <w:t>",</w:t>
+      </w:r>
+    </w:p>
+    <w:p>
+      <w:r>
+        <w:lastRenderedPageBreak/>
+        <w:t>“</w:t>
+      </w:r>
+      <w:proofErr w:type="spellStart"/>
+      <w:r>
+        <w:t>userName</w:t>
+      </w:r>
+      <w:proofErr w:type="spellEnd"/>
+      <w:r>
+        <w:t>”: “</w:t>
+      </w:r>
+      <w:r>
+        <w:t>driver3@jmathisgswoutlook.onmicrosoft.com</w:t>
+      </w:r>
+    </w:p>
+    <w:p>
+      <w:r>
+        <w:t>”,</w:t>
       </w:r>
     </w:p>
     <w:p>
@@ -719,7 +1100,19 @@
     </w:p>
     <w:p>
       <w:r>
-        <w:lastRenderedPageBreak/>
+        <w:t xml:space="preserve">    “</w:t>
+      </w:r>
+      <w:proofErr w:type="spellStart"/>
+      <w:r>
+        <w:t>endTime</w:t>
+      </w:r>
+      <w:proofErr w:type="spellEnd"/>
+      <w:r>
+        <w:t>”: “2026-02-11T23:21:21.342Z”</w:t>
+      </w:r>
+    </w:p>
+    <w:p>
+      <w:r>
         <w:t>}</w:t>
       </w:r>
     </w:p>
@@ -731,6 +1124,95 @@
       <w:proofErr w:type="spellStart"/>
       <w:r>
         <w:t>RoutePoints</w:t>
+      </w:r>
+      <w:proofErr w:type="spellEnd"/>
+      <w:r>
+        <w:t>:</w:t>
+      </w:r>
+    </w:p>
+    <w:p>
+      <w:r>
+        <w:t>{</w:t>
+      </w:r>
+    </w:p>
+    <w:p>
+      <w:r>
+        <w:t>    "id": "r-4177fc11-e6a8-4b57-a7c2-2723130497f1_1770851990904",</w:t>
+      </w:r>
+    </w:p>
+    <w:p>
+      <w:r>
+        <w:t xml:space="preserve">    </w:t>
+      </w:r>
+      <w:r>
+        <w:t>"</w:t>
+      </w:r>
+      <w:proofErr w:type="spellStart"/>
+      <w:r>
+        <w:t>routeId</w:t>
+      </w:r>
+      <w:proofErr w:type="spellEnd"/>
+      <w:r>
+        <w:t>": "r-4177fc11-e6a8-4b57-a7c2-2723130497f1",</w:t>
+      </w:r>
+    </w:p>
+    <w:p>
+      <w:r>
+        <w:t>    "</w:t>
+      </w:r>
+      <w:proofErr w:type="spellStart"/>
+      <w:r>
+        <w:t>ts</w:t>
+      </w:r>
+      <w:proofErr w:type="spellEnd"/>
+      <w:r>
+        <w:t>": 1770851990904,</w:t>
+      </w:r>
+    </w:p>
+    <w:p>
+      <w:r>
+        <w:t>    "</w:t>
+      </w:r>
+      <w:proofErr w:type="spellStart"/>
+      <w:r>
+        <w:t>lat</w:t>
+      </w:r>
+      <w:proofErr w:type="spellEnd"/>
+      <w:r>
+        <w:t>": 32.0567156,</w:t>
+      </w:r>
+    </w:p>
+    <w:p>
+      <w:r>
+        <w:t>    "</w:t>
+      </w:r>
+      <w:proofErr w:type="spellStart"/>
+      <w:r>
+        <w:t>lon</w:t>
+      </w:r>
+      <w:proofErr w:type="spellEnd"/>
+      <w:r>
+        <w:t>": -84.2171594,</w:t>
+      </w:r>
+    </w:p>
+    <w:p>
+      <w:r>
+        <w:t>    "speed": 0.9426706,</w:t>
+      </w:r>
+    </w:p>
+    <w:p>
+      <w:r>
+        <w:t>}</w:t>
+      </w:r>
+    </w:p>
+    <w:p/>
+    <w:p>
+      <w:r>
+        <w:tab/>
+      </w:r>
+      <w:proofErr w:type="spellStart"/>
+      <w:r>
+        <w:t>RouteSummaries</w:t>
       </w:r>
       <w:proofErr w:type="spellEnd"/>
       <w:r>
@@ -760,7 +1242,7 @@
         <w:rPr>
           <w:lang w:val="es-ES"/>
         </w:rPr>
-        <w:t>    "id": "r-4177fc11-e6a8-4b57-a7c2-2723130497f1_1770851990904",</w:t>
+        <w:t>    "id": "r-4177fc11-e6a8-4b57-a7c2-2723130497f1",</w:t>
       </w:r>
     </w:p>
     <w:p>
@@ -788,11 +1270,32 @@
       </w:r>
       <w:proofErr w:type="spellStart"/>
       <w:r>
-        <w:t>ts</w:t>
-      </w:r>
-      <w:proofErr w:type="spellEnd"/>
-      <w:r>
-        <w:t>": 1770851990904,</w:t>
+        <w:t>userId</w:t>
+      </w:r>
+      <w:proofErr w:type="spellEnd"/>
+      <w:r>
+        <w:t>": "</w:t>
+      </w:r>
+      <w:r>
+        <w:t>3517b7f7-0e95-4d79-b7d0-4c2f01244c2a</w:t>
+      </w:r>
+    </w:p>
+    <w:p>
+      <w:r>
+        <w:t>",</w:t>
+      </w:r>
+    </w:p>
+    <w:p>
+      <w:r>
+        <w:t xml:space="preserve">    “username”: “</w:t>
+      </w:r>
+      <w:r>
+        <w:t>driver3@jmathisgswoutlook.onmicrosoft.com</w:t>
+      </w:r>
+    </w:p>
+    <w:p>
+      <w:r>
+        <w:t>”,</w:t>
       </w:r>
     </w:p>
     <w:p>
@@ -801,29 +1304,77 @@
       </w:r>
       <w:proofErr w:type="spellStart"/>
       <w:r>
-        <w:t>lat</w:t>
-      </w:r>
-      <w:proofErr w:type="spellEnd"/>
-      <w:r>
-        <w:t>": 32.0567156,</w:t>
-      </w:r>
-    </w:p>
-    <w:p>
-      <w:r>
+        <w:t>pointCount</w:t>
+      </w:r>
+      <w:proofErr w:type="spellEnd"/>
+      <w:r>
+        <w:t>": 30,</w:t>
+      </w:r>
+    </w:p>
+    <w:p>
+      <w:r>
+        <w:lastRenderedPageBreak/>
         <w:t>    "</w:t>
       </w:r>
       <w:proofErr w:type="spellStart"/>
       <w:r>
-        <w:t>lon</w:t>
-      </w:r>
-      <w:proofErr w:type="spellEnd"/>
-      <w:r>
-        <w:t>": -84.2171594,</w:t>
-      </w:r>
-    </w:p>
-    <w:p>
-      <w:r>
-        <w:t>    "speed": 0.9426706,</w:t>
+        <w:t>durationSeconds</w:t>
+      </w:r>
+      <w:proofErr w:type="spellEnd"/>
+      <w:r>
+        <w:t>": 82689,</w:t>
+      </w:r>
+    </w:p>
+    <w:p>
+      <w:r>
+        <w:t>    "</w:t>
+      </w:r>
+      <w:proofErr w:type="spellStart"/>
+      <w:r>
+        <w:t>totalDistanceMeters</w:t>
+      </w:r>
+      <w:proofErr w:type="spellEnd"/>
+      <w:r>
+        <w:t>": 84.26994463319888,</w:t>
+      </w:r>
+    </w:p>
+    <w:p>
+      <w:r>
+        <w:t>    "</w:t>
+      </w:r>
+      <w:proofErr w:type="spellStart"/>
+      <w:r>
+        <w:t>totalDistanceMiles</w:t>
+      </w:r>
+      <w:proofErr w:type="spellEnd"/>
+      <w:r>
+        <w:t>": 0.05236291596650491,</w:t>
+      </w:r>
+    </w:p>
+    <w:p>
+      <w:r>
+        <w:t>    "</w:t>
+      </w:r>
+      <w:proofErr w:type="spellStart"/>
+      <w:r>
+        <w:t>averageSpeedMph</w:t>
+      </w:r>
+      <w:proofErr w:type="spellEnd"/>
+      <w:r>
+        <w:t>": 0.0022797084249148968,</w:t>
+      </w:r>
+    </w:p>
+    <w:p>
+      <w:r>
+        <w:t>    "</w:t>
+      </w:r>
+      <w:proofErr w:type="spellStart"/>
+      <w:r>
+        <w:t>completedAt</w:t>
+      </w:r>
+      <w:proofErr w:type="spellEnd"/>
+      <w:r>
+        <w:t>": "2026-02-11T23:20:50.191Z",</w:t>
       </w:r>
     </w:p>
     <w:p>
@@ -831,161 +1382,262 @@
         <w:t>}</w:t>
       </w:r>
     </w:p>
+    <w:p>
+      <w:r>
+        <w:t>Users</w:t>
+      </w:r>
+      <w:r>
+        <w:t>:</w:t>
+      </w:r>
+    </w:p>
+    <w:p>
+      <w:r>
+        <w:t>{</w:t>
+      </w:r>
+    </w:p>
+    <w:p>
+      <w:r>
+        <w:t>    "id": "</w:t>
+      </w:r>
+      <w:r>
+        <w:t>3517b7f7-0e95-4d79-b7d0-4c2f01244c2a</w:t>
+      </w:r>
+      <w:r>
+        <w:t>",</w:t>
+      </w:r>
+    </w:p>
+    <w:p>
+      <w:r>
+        <w:t>    "</w:t>
+      </w:r>
+      <w:proofErr w:type="spellStart"/>
+      <w:r>
+        <w:t>userId</w:t>
+      </w:r>
+      <w:proofErr w:type="spellEnd"/>
+      <w:r>
+        <w:t>": "</w:t>
+      </w:r>
+      <w:r>
+        <w:t>3517b7f7-0e95-4d79-b7d0-4c2f01244c2a</w:t>
+      </w:r>
+    </w:p>
+    <w:p>
+      <w:r>
+        <w:t>",</w:t>
+      </w:r>
+    </w:p>
+    <w:p>
+      <w:r>
+        <w:t xml:space="preserve">    “username”: “</w:t>
+      </w:r>
+      <w:r>
+        <w:t>driver3@jmathisgswoutlook.onmicrosoft.com</w:t>
+      </w:r>
+    </w:p>
+    <w:p>
+      <w:r>
+        <w:t>”,</w:t>
+      </w:r>
+    </w:p>
+    <w:p>
+      <w:r>
+        <w:t>    "</w:t>
+      </w:r>
+      <w:r>
+        <w:t>role</w:t>
+      </w:r>
+      <w:r>
+        <w:t xml:space="preserve">": </w:t>
+      </w:r>
+      <w:r>
+        <w:t>“Driver”</w:t>
+      </w:r>
+      <w:r>
+        <w:t>,</w:t>
+      </w:r>
+    </w:p>
+    <w:p>
+      <w:r>
+        <w:t>    "</w:t>
+      </w:r>
+      <w:proofErr w:type="spellStart"/>
+      <w:r>
+        <w:t>managerId</w:t>
+      </w:r>
+      <w:proofErr w:type="spellEnd"/>
+      <w:r>
+        <w:t xml:space="preserve">": </w:t>
+      </w:r>
+      <w:r>
+        <w:t>“</w:t>
+      </w:r>
+      <w:r>
+        <w:t>ec3cc791-3dc0-43c3-8527-c13b215191a3</w:t>
+      </w:r>
+    </w:p>
+    <w:p>
+      <w:r>
+        <w:t>,</w:t>
+      </w:r>
+    </w:p>
+    <w:p>
+      <w:r>
+        <w:t>    "</w:t>
+      </w:r>
+      <w:proofErr w:type="spellStart"/>
+      <w:r>
+        <w:t>created</w:t>
+      </w:r>
+      <w:r>
+        <w:t>At</w:t>
+      </w:r>
+      <w:proofErr w:type="spellEnd"/>
+      <w:r>
+        <w:t>": "</w:t>
+      </w:r>
+      <w:r>
+        <w:t>2026-02-23T22:55:45.605Z</w:t>
+      </w:r>
+    </w:p>
+    <w:p>
+      <w:r>
+        <w:t>",</w:t>
+      </w:r>
+    </w:p>
+    <w:p>
+      <w:r>
+        <w:t>}</w:t>
+      </w:r>
+    </w:p>
+    <w:p>
+      <w:r>
+        <w:t>Assignments:</w:t>
+      </w:r>
+    </w:p>
+    <w:p>
+      <w:r>
+        <w:t>{</w:t>
+      </w:r>
+    </w:p>
+    <w:p>
+      <w:r>
+        <w:t>    "id": "a-d0c45a83-991d-42ea-bc0d-4d4bb21dcc78",</w:t>
+      </w:r>
+    </w:p>
+    <w:p>
+      <w:r>
+        <w:t>    "</w:t>
+      </w:r>
+      <w:proofErr w:type="spellStart"/>
+      <w:r>
+        <w:t>driverId</w:t>
+      </w:r>
+      <w:proofErr w:type="spellEnd"/>
+      <w:r>
+        <w:t>": "3517b7f7-0e95-4d79-b7d0-4c2f01244c2a",</w:t>
+      </w:r>
+    </w:p>
+    <w:p>
+      <w:r>
+        <w:t>    "</w:t>
+      </w:r>
+      <w:proofErr w:type="spellStart"/>
+      <w:r>
+        <w:t>driverEmail</w:t>
+      </w:r>
+      <w:proofErr w:type="spellEnd"/>
+      <w:r>
+        <w:t>": "driver3@jmathisgswoutlook.onmicrosoft.com",</w:t>
+      </w:r>
+    </w:p>
+    <w:p>
+      <w:r>
+        <w:t>    "</w:t>
+      </w:r>
+      <w:proofErr w:type="spellStart"/>
+      <w:r>
+        <w:t>createdById</w:t>
+      </w:r>
+      <w:proofErr w:type="spellEnd"/>
+      <w:r>
+        <w:t>": "bacc3dac-6959-4219-a681-6bd321e1baa4",</w:t>
+      </w:r>
+    </w:p>
+    <w:p>
+      <w:r>
+        <w:t>    "</w:t>
+      </w:r>
+      <w:proofErr w:type="spellStart"/>
+      <w:r>
+        <w:t>createdByRole</w:t>
+      </w:r>
+      <w:proofErr w:type="spellEnd"/>
+      <w:r>
+        <w:t>": "Admin",</w:t>
+      </w:r>
+    </w:p>
+    <w:p>
+      <w:r>
+        <w:lastRenderedPageBreak/>
+        <w:t>    "title": "Deliver items",</w:t>
+      </w:r>
+    </w:p>
+    <w:p>
+      <w:r>
+        <w:t>    "notes": "7634 Cason St",</w:t>
+      </w:r>
+    </w:p>
+    <w:p>
+      <w:r>
+        <w:t>    "priority": "Normal",</w:t>
+      </w:r>
+    </w:p>
+    <w:p>
+      <w:r>
+        <w:t>    "status": "Open",</w:t>
+      </w:r>
+    </w:p>
+    <w:p>
+      <w:r>
+        <w:t>    "</w:t>
+      </w:r>
+      <w:proofErr w:type="spellStart"/>
+      <w:r>
+        <w:t>createdAt</w:t>
+      </w:r>
+      <w:proofErr w:type="spellEnd"/>
+      <w:r>
+        <w:t>": "2026-03-04T</w:t>
+      </w:r>
+      <w:proofErr w:type="gramStart"/>
+      <w:r>
+        <w:t>21</w:t>
+      </w:r>
+      <w:proofErr w:type="gramEnd"/>
+      <w:r>
+        <w:t>:52:54.526Z",</w:t>
+      </w:r>
+    </w:p>
+    <w:p>
+      <w:r>
+        <w:t>    "</w:t>
+      </w:r>
+      <w:proofErr w:type="spellStart"/>
+      <w:r>
+        <w:t>updatedAt</w:t>
+      </w:r>
+      <w:proofErr w:type="spellEnd"/>
+      <w:r>
+        <w:t>": "2026-03-04T21:52:54.526Z"</w:t>
+      </w:r>
+    </w:p>
+    <w:p>
+      <w:r>
+        <w:t>}</w:t>
+      </w:r>
+    </w:p>
     <w:p/>
-    <w:p>
-      <w:r>
-        <w:tab/>
-      </w:r>
-      <w:proofErr w:type="spellStart"/>
-      <w:r>
-        <w:t>RouteSummaries</w:t>
-      </w:r>
-      <w:proofErr w:type="spellEnd"/>
-      <w:r>
-        <w:t>:</w:t>
-      </w:r>
-    </w:p>
-    <w:p>
-      <w:pPr>
-        <w:rPr>
-          <w:lang w:val="es-ES"/>
-        </w:rPr>
-      </w:pPr>
-      <w:r>
-        <w:rPr>
-          <w:lang w:val="es-ES"/>
-        </w:rPr>
-        <w:t>{</w:t>
-      </w:r>
-    </w:p>
-    <w:p>
-      <w:pPr>
-        <w:rPr>
-          <w:lang w:val="es-ES"/>
-        </w:rPr>
-      </w:pPr>
-      <w:r>
-        <w:rPr>
-          <w:lang w:val="es-ES"/>
-        </w:rPr>
-        <w:t>    "id": "r-4177fc11-e6a8-4b57-a7c2-2723130497f1",</w:t>
-      </w:r>
-    </w:p>
-    <w:p>
-      <w:r>
-        <w:rPr>
-          <w:lang w:val="es-ES"/>
-        </w:rPr>
-        <w:t xml:space="preserve">    </w:t>
-      </w:r>
-      <w:r>
-        <w:t>"</w:t>
-      </w:r>
-      <w:proofErr w:type="spellStart"/>
-      <w:r>
-        <w:t>routeId</w:t>
-      </w:r>
-      <w:proofErr w:type="spellEnd"/>
-      <w:r>
-        <w:t>": "r-4177fc11-e6a8-4b57-a7c2-2723130497f1",</w:t>
-      </w:r>
-    </w:p>
-    <w:p>
-      <w:r>
-        <w:t>    "</w:t>
-      </w:r>
-      <w:proofErr w:type="spellStart"/>
-      <w:r>
-        <w:t>userId</w:t>
-      </w:r>
-      <w:proofErr w:type="spellEnd"/>
-      <w:r>
-        <w:t>": "test-user",</w:t>
-      </w:r>
-    </w:p>
-    <w:p>
-      <w:r>
-        <w:t>    "</w:t>
-      </w:r>
-      <w:proofErr w:type="spellStart"/>
-      <w:r>
-        <w:t>pointCount</w:t>
-      </w:r>
-      <w:proofErr w:type="spellEnd"/>
-      <w:r>
-        <w:t>": 30,</w:t>
-      </w:r>
-    </w:p>
-    <w:p>
-      <w:r>
-        <w:t>    "</w:t>
-      </w:r>
-      <w:proofErr w:type="spellStart"/>
-      <w:r>
-        <w:t>durationSeconds</w:t>
-      </w:r>
-      <w:proofErr w:type="spellEnd"/>
-      <w:r>
-        <w:t>": 82689,</w:t>
-      </w:r>
-    </w:p>
-    <w:p>
-      <w:r>
-        <w:t>    "</w:t>
-      </w:r>
-      <w:proofErr w:type="spellStart"/>
-      <w:r>
-        <w:t>totalDistanceMeters</w:t>
-      </w:r>
-      <w:proofErr w:type="spellEnd"/>
-      <w:r>
-        <w:t>": 84.26994463319888,</w:t>
-      </w:r>
-    </w:p>
-    <w:p>
-      <w:r>
-        <w:t>    "</w:t>
-      </w:r>
-      <w:proofErr w:type="spellStart"/>
-      <w:r>
-        <w:t>totalDistanceMiles</w:t>
-      </w:r>
-      <w:proofErr w:type="spellEnd"/>
-      <w:r>
-        <w:t>": 0.05236291596650491,</w:t>
-      </w:r>
-    </w:p>
-    <w:p>
-      <w:r>
-        <w:t>    "</w:t>
-      </w:r>
-      <w:proofErr w:type="spellStart"/>
-      <w:r>
-        <w:t>averageSpeedMph</w:t>
-      </w:r>
-      <w:proofErr w:type="spellEnd"/>
-      <w:r>
-        <w:t>": 0.0022797084249148968,</w:t>
-      </w:r>
-    </w:p>
-    <w:p>
-      <w:r>
-        <w:t>    "</w:t>
-      </w:r>
-      <w:proofErr w:type="spellStart"/>
-      <w:r>
-        <w:t>completedAt</w:t>
-      </w:r>
-      <w:proofErr w:type="spellEnd"/>
-      <w:r>
-        <w:t>": "2026-02-11T23:20:50.191Z",</w:t>
-      </w:r>
-    </w:p>
-    <w:p>
-      <w:r>
-        <w:t>}</w:t>
-      </w:r>
-    </w:p>
     <w:p/>
     <w:sectPr>
       <w:pgSz w:w="12240" w:h="15840"/>

</xml_diff>